<commit_message>
Email Integration, Email Free Style Project
</commit_message>
<xml_diff>
--- a/Session-20/03 Email Pipeline.docx
+++ b/Session-20/03 Email Pipeline.docx
@@ -353,6 +353,29 @@
           </wp:inline>
         </w:drawing>
       </w:r>
+    </w:p>
+    <w:p>
+      <w:pPr>
+        <w:pStyle w:val="ListParagraph"/>
+        <w:rPr>
+          <w:lang w:val="en-US"/>
+        </w:rPr>
+      </w:pPr>
+      <w:r>
+        <w:rPr>
+          <w:lang w:val="en-US"/>
+        </w:rPr>
+        <w:lastRenderedPageBreak/>
+        <w:t>Now try adding the another pipeline which will fail and send an email to your email id entered in pipeline</w:t>
+      </w:r>
+    </w:p>
+    <w:p>
+      <w:pPr>
+        <w:pStyle w:val="ListParagraph"/>
+        <w:rPr>
+          <w:lang w:val="en-US"/>
+        </w:rPr>
+      </w:pPr>
       <w:bookmarkStart w:id="0" w:name="_GoBack"/>
       <w:bookmarkEnd w:id="0"/>
     </w:p>

</xml_diff>